<commit_message>
docs: Priorizacion 2da tanda CU finalizada
</commit_message>
<xml_diff>
--- a/Etapa Construcción - Iteración 2/EspecificacionCU21 - Kairos - NexTech.docx
+++ b/Etapa Construcción - Iteración 2/EspecificacionCU21 - Kairos - NexTech.docx
@@ -306,12 +306,12 @@
                 <wp:extent cx="7978140" cy="848995"/>
                 <wp:effectExtent b="0" l="0" r="0" t="0"/>
                 <wp:wrapNone/>
-                <wp:docPr id="79" name="image13.png"/>
+                <wp:docPr id="79" name="image12.png"/>
                 <a:graphic>
                   <a:graphicData uri="http://schemas.openxmlformats.org/drawingml/2006/picture">
                     <pic:pic>
                       <pic:nvPicPr>
-                        <pic:cNvPr id="0" name="image13.png"/>
+                        <pic:cNvPr id="0" name="image12.png"/>
                         <pic:cNvPicPr preferRelativeResize="0"/>
                       </pic:nvPicPr>
                       <pic:blipFill>
@@ -426,12 +426,12 @@
                 <wp:extent cx="141605" cy="11266170"/>
                 <wp:effectExtent b="0" l="0" r="0" t="0"/>
                 <wp:wrapNone/>
-                <wp:docPr id="77" name="image11.png"/>
+                <wp:docPr id="77" name="image10.png"/>
                 <a:graphic>
                   <a:graphicData uri="http://schemas.openxmlformats.org/drawingml/2006/picture">
                     <pic:pic>
                       <pic:nvPicPr>
-                        <pic:cNvPr id="0" name="image11.png"/>
+                        <pic:cNvPr id="0" name="image10.png"/>
                         <pic:cNvPicPr preferRelativeResize="0"/>
                       </pic:nvPicPr>
                       <pic:blipFill>
@@ -546,12 +546,12 @@
                 <wp:extent cx="141605" cy="11266170"/>
                 <wp:effectExtent b="0" l="0" r="0" t="0"/>
                 <wp:wrapNone/>
-                <wp:docPr id="81" name="image15.png"/>
+                <wp:docPr id="81" name="image14.png"/>
                 <a:graphic>
                   <a:graphicData uri="http://schemas.openxmlformats.org/drawingml/2006/picture">
                     <pic:pic>
                       <pic:nvPicPr>
-                        <pic:cNvPr id="0" name="image15.png"/>
+                        <pic:cNvPr id="0" name="image14.png"/>
                         <pic:cNvPicPr preferRelativeResize="0"/>
                       </pic:nvPicPr>
                       <pic:blipFill>
@@ -666,12 +666,12 @@
                 <wp:extent cx="7978140" cy="848995"/>
                 <wp:effectExtent b="0" l="0" r="0" t="0"/>
                 <wp:wrapNone/>
-                <wp:docPr id="80" name="image14.png"/>
+                <wp:docPr id="80" name="image13.png"/>
                 <a:graphic>
                   <a:graphicData uri="http://schemas.openxmlformats.org/drawingml/2006/picture">
                     <pic:pic>
                       <pic:nvPicPr>
-                        <pic:cNvPr id="0" name="image14.png"/>
+                        <pic:cNvPr id="0" name="image13.png"/>
                         <pic:cNvPicPr preferRelativeResize="0"/>
                       </pic:nvPicPr>
                       <pic:blipFill>
@@ -1090,12 +1090,12 @@
             <wp:extent cx="1200150" cy="1200150"/>
             <wp:effectExtent b="0" l="0" r="0" t="0"/>
             <wp:wrapSquare wrapText="bothSides" distB="0" distT="0" distL="114300" distR="114300"/>
-            <wp:docPr descr="psi-negro.png" id="86" name="image3.png"/>
+            <wp:docPr descr="psi-negro.png" id="86" name="image1.png"/>
             <a:graphic>
               <a:graphicData uri="http://schemas.openxmlformats.org/drawingml/2006/picture">
                 <pic:pic>
                   <pic:nvPicPr>
-                    <pic:cNvPr descr="psi-negro.png" id="0" name="image3.png"/>
+                    <pic:cNvPr descr="psi-negro.png" id="0" name="image1.png"/>
                     <pic:cNvPicPr preferRelativeResize="0"/>
                   </pic:nvPicPr>
                   <pic:blipFill>
@@ -1145,12 +1145,12 @@
             <wp:extent cx="1304925" cy="2019300"/>
             <wp:effectExtent b="0" l="0" r="0" t="0"/>
             <wp:wrapSquare wrapText="bothSides" distB="0" distT="0" distL="114300" distR="114300"/>
-            <wp:docPr descr="UNPA.JPG" id="87" name="image1.jpg"/>
+            <wp:docPr descr="UNPA.JPG" id="87" name="image3.jpg"/>
             <a:graphic>
               <a:graphicData uri="http://schemas.openxmlformats.org/drawingml/2006/picture">
                 <pic:pic>
                   <pic:nvPicPr>
-                    <pic:cNvPr descr="UNPA.JPG" id="0" name="image1.jpg"/>
+                    <pic:cNvPr descr="UNPA.JPG" id="0" name="image3.jpg"/>
                     <pic:cNvPicPr preferRelativeResize="0"/>
                   </pic:nvPicPr>
                   <pic:blipFill>
@@ -1282,7 +1282,7 @@
     </w:p>
     <w:sdt>
       <w:sdtPr>
-        <w:id w:val="-163270027"/>
+        <w:id w:val="1717785829"/>
         <w:docPartObj>
           <w:docPartGallery w:val="Table of Contents"/>
           <w:docPartUnique w:val="1"/>
@@ -1298,13 +1298,11 @@
             <w:spacing w:before="60" w:line="240" w:lineRule="auto"/>
             <w:ind w:left="0"/>
             <w:rPr>
-              <w:rFonts w:ascii="Arial" w:cs="Arial" w:eastAsia="Arial" w:hAnsi="Arial"/>
+              <w:b w:val="1"/>
               <w:i w:val="0"/>
               <w:smallCaps w:val="0"/>
               <w:strike w:val="0"/>
-              <w:color w:val="000000"/>
-              <w:sz w:val="22"/>
-              <w:szCs w:val="22"/>
+              <w:color w:val="366091"/>
               <w:u w:val="none"/>
               <w:shd w:fill="auto" w:val="clear"/>
               <w:vertAlign w:val="baseline"/>
@@ -1318,13 +1316,11 @@
           <w:hyperlink w:anchor="_heading=h.ncnjke955axu">
             <w:r>
               <w:rPr>
-                <w:rFonts w:ascii="Cambria" w:cs="Cambria" w:eastAsia="Cambria" w:hAnsi="Cambria"/>
+                <w:b w:val="1"/>
                 <w:i w:val="0"/>
                 <w:smallCaps w:val="0"/>
                 <w:strike w:val="0"/>
-                <w:color w:val="000000"/>
-                <w:sz w:val="24"/>
-                <w:szCs w:val="24"/>
+                <w:color w:val="366091"/>
                 <w:u w:val="none"/>
                 <w:shd w:fill="auto" w:val="clear"/>
                 <w:vertAlign w:val="baseline"/>
@@ -1350,13 +1346,11 @@
             <w:spacing w:before="60" w:line="240" w:lineRule="auto"/>
             <w:ind w:left="0"/>
             <w:rPr>
-              <w:rFonts w:ascii="Arial" w:cs="Arial" w:eastAsia="Arial" w:hAnsi="Arial"/>
+              <w:b w:val="1"/>
               <w:i w:val="0"/>
               <w:smallCaps w:val="0"/>
               <w:strike w:val="0"/>
-              <w:color w:val="000000"/>
-              <w:sz w:val="22"/>
-              <w:szCs w:val="22"/>
+              <w:color w:val="366091"/>
               <w:u w:val="none"/>
               <w:shd w:fill="auto" w:val="clear"/>
               <w:vertAlign w:val="baseline"/>
@@ -1365,13 +1359,11 @@
           <w:hyperlink w:anchor="_heading=h.8606iud146lw">
             <w:r>
               <w:rPr>
-                <w:rFonts w:ascii="Cambria" w:cs="Cambria" w:eastAsia="Cambria" w:hAnsi="Cambria"/>
+                <w:b w:val="1"/>
                 <w:i w:val="0"/>
                 <w:smallCaps w:val="0"/>
                 <w:strike w:val="0"/>
-                <w:color w:val="000000"/>
-                <w:sz w:val="24"/>
-                <w:szCs w:val="24"/>
+                <w:color w:val="366091"/>
                 <w:u w:val="none"/>
                 <w:shd w:fill="auto" w:val="clear"/>
                 <w:vertAlign w:val="baseline"/>
@@ -1856,7 +1848,7 @@
     <w:sdt>
       <w:sdtPr>
         <w:lock w:val="contentLocked"/>
-        <w:id w:val="-1561101408"/>
+        <w:id w:val="-1491735716"/>
         <w:tag w:val="goog_rdk_0"/>
       </w:sdtPr>
       <w:sdtContent>
@@ -3012,12 +3004,12 @@
           <wp:inline distB="114300" distT="114300" distL="114300" distR="114300">
             <wp:extent cx="5399730" cy="3860800"/>
             <wp:effectExtent b="0" l="0" r="0" t="0"/>
-            <wp:docPr id="83" name="image4.png"/>
+            <wp:docPr id="83" name="image16.png"/>
             <a:graphic>
               <a:graphicData uri="http://schemas.openxmlformats.org/drawingml/2006/picture">
                 <pic:pic>
                   <pic:nvPicPr>
-                    <pic:cNvPr id="0" name="image4.png"/>
+                    <pic:cNvPr id="0" name="image16.png"/>
                     <pic:cNvPicPr preferRelativeResize="0"/>
                   </pic:nvPicPr>
                   <pic:blipFill>
@@ -3660,12 +3652,12 @@
               <wp:extent cx="7549515" cy="815340"/>
               <wp:effectExtent b="0" l="0" r="0" t="0"/>
               <wp:wrapNone/>
-              <wp:docPr id="71" name="image5.png"/>
+              <wp:docPr id="71" name="image4.png"/>
               <a:graphic>
                 <a:graphicData uri="http://schemas.openxmlformats.org/drawingml/2006/picture">
                   <pic:pic>
                     <pic:nvPicPr>
-                      <pic:cNvPr id="0" name="image5.png"/>
+                      <pic:cNvPr id="0" name="image4.png"/>
                       <pic:cNvPicPr preferRelativeResize="0"/>
                     </pic:nvPicPr>
                     <pic:blipFill>
@@ -3767,12 +3759,12 @@
               <wp:extent cx="128905" cy="836930"/>
               <wp:effectExtent b="0" l="0" r="0" t="0"/>
               <wp:wrapNone/>
-              <wp:docPr id="82" name="image16.png"/>
+              <wp:docPr id="82" name="image15.png"/>
               <a:graphic>
                 <a:graphicData uri="http://schemas.openxmlformats.org/drawingml/2006/picture">
                   <pic:pic>
                     <pic:nvPicPr>
-                      <pic:cNvPr id="0" name="image16.png"/>
+                      <pic:cNvPr id="0" name="image15.png"/>
                       <pic:cNvPicPr preferRelativeResize="0"/>
                     </pic:nvPicPr>
                     <pic:blipFill>
@@ -3874,12 +3866,12 @@
               <wp:extent cx="128905" cy="850265"/>
               <wp:effectExtent b="0" l="0" r="0" t="0"/>
               <wp:wrapNone/>
-              <wp:docPr id="78" name="image12.png"/>
+              <wp:docPr id="78" name="image11.png"/>
               <a:graphic>
                 <a:graphicData uri="http://schemas.openxmlformats.org/drawingml/2006/picture">
                   <pic:pic>
                     <pic:nvPicPr>
-                      <pic:cNvPr id="0" name="image12.png"/>
+                      <pic:cNvPr id="0" name="image11.png"/>
                       <pic:cNvPicPr preferRelativeResize="0"/>
                     </pic:nvPicPr>
                     <pic:blipFill>
@@ -3981,12 +3973,12 @@
               <wp:extent cx="128905" cy="850265"/>
               <wp:effectExtent b="0" l="0" r="0" t="0"/>
               <wp:wrapNone/>
-              <wp:docPr id="73" name="image7.png"/>
+              <wp:docPr id="73" name="image6.png"/>
               <a:graphic>
                 <a:graphicData uri="http://schemas.openxmlformats.org/drawingml/2006/picture">
                   <pic:pic>
                     <pic:nvPicPr>
-                      <pic:cNvPr id="0" name="image7.png"/>
+                      <pic:cNvPr id="0" name="image6.png"/>
                       <pic:cNvPicPr preferRelativeResize="0"/>
                     </pic:nvPicPr>
                     <pic:blipFill>
@@ -4088,12 +4080,12 @@
               <wp:extent cx="128905" cy="836930"/>
               <wp:effectExtent b="0" l="0" r="0" t="0"/>
               <wp:wrapNone/>
-              <wp:docPr id="72" name="image6.png"/>
+              <wp:docPr id="72" name="image5.png"/>
               <a:graphic>
                 <a:graphicData uri="http://schemas.openxmlformats.org/drawingml/2006/picture">
                   <pic:pic>
                     <pic:nvPicPr>
-                      <pic:cNvPr id="0" name="image6.png"/>
+                      <pic:cNvPr id="0" name="image5.png"/>
                       <pic:cNvPicPr preferRelativeResize="0"/>
                     </pic:nvPicPr>
                     <pic:blipFill>
@@ -4432,12 +4424,12 @@
               <wp:extent cx="7549515" cy="815340"/>
               <wp:effectExtent b="0" l="0" r="0" t="0"/>
               <wp:wrapNone/>
-              <wp:docPr id="75" name="image9.png"/>
+              <wp:docPr id="75" name="image8.png"/>
               <a:graphic>
                 <a:graphicData uri="http://schemas.openxmlformats.org/drawingml/2006/picture">
                   <pic:pic>
                     <pic:nvPicPr>
-                      <pic:cNvPr id="0" name="image9.png"/>
+                      <pic:cNvPr id="0" name="image8.png"/>
                       <pic:cNvPicPr preferRelativeResize="0"/>
                     </pic:nvPicPr>
                     <pic:blipFill>
@@ -4479,12 +4471,12 @@
           <wp:extent cx="669290" cy="669290"/>
           <wp:effectExtent b="0" l="0" r="0" t="0"/>
           <wp:wrapSquare wrapText="bothSides" distB="0" distT="0" distL="114300" distR="114300"/>
-          <wp:docPr descr="psi-negro.png" id="85" name="image3.png"/>
+          <wp:docPr descr="psi-negro.png" id="85" name="image1.png"/>
           <a:graphic>
             <a:graphicData uri="http://schemas.openxmlformats.org/drawingml/2006/picture">
               <pic:pic>
                 <pic:nvPicPr>
-                  <pic:cNvPr descr="psi-negro.png" id="0" name="image3.png"/>
+                  <pic:cNvPr descr="psi-negro.png" id="0" name="image1.png"/>
                   <pic:cNvPicPr preferRelativeResize="0"/>
                 </pic:nvPicPr>
                 <pic:blipFill>
@@ -4632,12 +4624,12 @@
               <wp:extent cx="128905" cy="836930"/>
               <wp:effectExtent b="0" l="0" r="0" t="0"/>
               <wp:wrapNone/>
-              <wp:docPr id="74" name="image8.png"/>
+              <wp:docPr id="74" name="image7.png"/>
               <a:graphic>
                 <a:graphicData uri="http://schemas.openxmlformats.org/drawingml/2006/picture">
                   <pic:pic>
                     <pic:nvPicPr>
-                      <pic:cNvPr id="0" name="image8.png"/>
+                      <pic:cNvPr id="0" name="image7.png"/>
                       <pic:cNvPicPr preferRelativeResize="0"/>
                     </pic:nvPicPr>
                     <pic:blipFill>
@@ -4742,12 +4734,12 @@
               <wp:extent cx="128905" cy="837565"/>
               <wp:effectExtent b="0" l="0" r="0" t="0"/>
               <wp:wrapNone/>
-              <wp:docPr id="76" name="image10.png"/>
+              <wp:docPr id="76" name="image9.png"/>
               <a:graphic>
                 <a:graphicData uri="http://schemas.openxmlformats.org/drawingml/2006/picture">
                   <pic:pic>
                     <pic:nvPicPr>
-                      <pic:cNvPr id="0" name="image10.png"/>
+                      <pic:cNvPr id="0" name="image9.png"/>
                       <pic:cNvPicPr preferRelativeResize="0"/>
                     </pic:nvPicPr>
                     <pic:blipFill>

</xml_diff>